<commit_message>
Generate editable DOCX documents for all chapters in notes/ except Human Physiology unit, Ch5 Class 12, and Ch6 Class 12
</commit_message>
<xml_diff>
--- a/notes/class 11/Ch4_AnimalKingdom/Ch4_AnimalKingdom.docx
+++ b/notes/class 11/Ch4_AnimalKingdom/Ch4_AnimalKingdom.docx
@@ -26,6 +26,31 @@
           <w:b/>
           <w:color w:val="111827"/>
           <w:sz w:val="48"/>
+        </w:rPr>
+        <w:t>Animal Kingdom</w:t>
+      </w:r>
+    </w:p>
+    <w:p>
+      <w:pPr>
+        <w:spacing w:before="20" w:after="60"/>
+        <w:ind w:left="283"/>
+      </w:pPr>
+      <w:r>
+        <w:rPr>
+          <w:rFonts w:ascii="Times New Roman" w:hAnsi="Times New Roman"/>
+          <w:b/>
+          <w:color w:val="1F2937"/>
+          <w:sz w:val="21"/>
+        </w:rPr>
+        <w:t xml:space="preserve">•  </w:t>
+      </w:r>
+      <w:r>
+        <w:rPr>
+          <w:rFonts w:ascii="Times New Roman" w:hAnsi="Times New Roman"/>
+          <w:b w:val="0"/>
+          <w:i w:val="0"/>
+          <w:color w:val="111827"/>
+          <w:sz w:val="21"/>
         </w:rPr>
         <w:t>Animal Kingdom</w:t>
       </w:r>
@@ -934,8 +959,8 @@
             <w:tcMar>
               <w:top w:w="60" w:type="dxa"/>
               <w:bottom w:w="60" w:type="dxa"/>
-              <w:left w:w="60" w:type="dxa"/>
-              <w:right w:w="60" w:type="dxa"/>
+              <w:left w:w="40" w:type="dxa"/>
+              <w:right w:w="40" w:type="dxa"/>
             </w:tcMar>
           </w:tcPr>
           <w:p>
@@ -1013,8 +1038,8 @@
             <w:tcMar>
               <w:top w:w="60" w:type="dxa"/>
               <w:bottom w:w="60" w:type="dxa"/>
-              <w:left w:w="60" w:type="dxa"/>
-              <w:right w:w="60" w:type="dxa"/>
+              <w:left w:w="40" w:type="dxa"/>
+              <w:right w:w="40" w:type="dxa"/>
             </w:tcMar>
           </w:tcPr>
           <w:p>
@@ -1648,7 +1673,7 @@
       <w:r>
         <w:drawing>
           <wp:inline xmlns:a="http://schemas.openxmlformats.org/drawingml/2006/main" xmlns:pic="http://schemas.openxmlformats.org/drawingml/2006/picture">
-            <wp:extent cx="2339996" cy="2247192"/>
+            <wp:extent cx="2073596" cy="1991357"/>
             <wp:docPr id="4" name="Picture 4"/>
             <wp:cNvGraphicFramePr>
               <a:graphicFrameLocks noChangeAspect="1"/>
@@ -1669,7 +1694,7 @@
                   <pic:spPr>
                     <a:xfrm>
                       <a:off x="0" y="0"/>
-                      <a:ext cx="2339996" cy="2247192"/>
+                      <a:ext cx="2073596" cy="1991357"/>
                     </a:xfrm>
                     <a:prstGeom prst="rect"/>
                   </pic:spPr>
@@ -2571,7 +2596,7 @@
       <w:r>
         <w:drawing>
           <wp:inline xmlns:a="http://schemas.openxmlformats.org/drawingml/2006/main" xmlns:pic="http://schemas.openxmlformats.org/drawingml/2006/picture">
-            <wp:extent cx="5723991" cy="2957203"/>
+            <wp:extent cx="4132793" cy="2135138"/>
             <wp:docPr id="5" name="Picture 5"/>
             <wp:cNvGraphicFramePr>
               <a:graphicFrameLocks noChangeAspect="1"/>
@@ -2592,7 +2617,7 @@
                   <pic:spPr>
                     <a:xfrm>
                       <a:off x="0" y="0"/>
-                      <a:ext cx="5723991" cy="2957203"/>
+                      <a:ext cx="4132793" cy="2135138"/>
                     </a:xfrm>
                     <a:prstGeom prst="rect"/>
                   </pic:spPr>
@@ -3966,8 +3991,8 @@
             <w:tcMar>
               <w:top w:w="60" w:type="dxa"/>
               <w:bottom w:w="60" w:type="dxa"/>
-              <w:left w:w="60" w:type="dxa"/>
-              <w:right w:w="60" w:type="dxa"/>
+              <w:left w:w="40" w:type="dxa"/>
+              <w:right w:w="40" w:type="dxa"/>
             </w:tcMar>
           </w:tcPr>
           <w:p>
@@ -3979,7 +4004,7 @@
             <w:r>
               <w:drawing>
                 <wp:inline xmlns:a="http://schemas.openxmlformats.org/drawingml/2006/main" xmlns:pic="http://schemas.openxmlformats.org/drawingml/2006/picture">
-                  <wp:extent cx="3060000" cy="2015950"/>
+                  <wp:extent cx="3059995" cy="2015947"/>
                   <wp:docPr id="7" name="Picture 7"/>
                   <wp:cNvGraphicFramePr>
                     <a:graphicFrameLocks noChangeAspect="1"/>
@@ -4000,7 +4025,7 @@
                         <pic:spPr>
                           <a:xfrm>
                             <a:off x="0" y="0"/>
-                            <a:ext cx="3060000" cy="2015950"/>
+                            <a:ext cx="3059995" cy="2015947"/>
                           </a:xfrm>
                           <a:prstGeom prst="rect"/>
                         </pic:spPr>
@@ -4045,8 +4070,8 @@
             <w:tcMar>
               <w:top w:w="60" w:type="dxa"/>
               <w:bottom w:w="60" w:type="dxa"/>
-              <w:left w:w="60" w:type="dxa"/>
-              <w:right w:w="60" w:type="dxa"/>
+              <w:left w:w="40" w:type="dxa"/>
+              <w:right w:w="40" w:type="dxa"/>
             </w:tcMar>
           </w:tcPr>
           <w:p>
@@ -6183,7 +6208,7 @@
       <w:r>
         <w:drawing>
           <wp:inline xmlns:a="http://schemas.openxmlformats.org/drawingml/2006/main" xmlns:pic="http://schemas.openxmlformats.org/drawingml/2006/picture">
-            <wp:extent cx="2879995" cy="2975527"/>
+            <wp:extent cx="2494796" cy="2577550"/>
             <wp:docPr id="13" name="Picture 13"/>
             <wp:cNvGraphicFramePr>
               <a:graphicFrameLocks noChangeAspect="1"/>
@@ -6204,7 +6229,7 @@
                   <pic:spPr>
                     <a:xfrm>
                       <a:off x="0" y="0"/>
-                      <a:ext cx="2879995" cy="2975527"/>
+                      <a:ext cx="2494796" cy="2577550"/>
                     </a:xfrm>
                     <a:prstGeom prst="rect"/>
                   </pic:spPr>
@@ -6676,7 +6701,7 @@
       <w:r>
         <w:drawing>
           <wp:inline xmlns:a="http://schemas.openxmlformats.org/drawingml/2006/main" xmlns:pic="http://schemas.openxmlformats.org/drawingml/2006/picture">
-            <wp:extent cx="2267996" cy="2460044"/>
+            <wp:extent cx="2869195" cy="3112151"/>
             <wp:docPr id="14" name="Picture 14"/>
             <wp:cNvGraphicFramePr>
               <a:graphicFrameLocks noChangeAspect="1"/>
@@ -6697,7 +6722,7 @@
                   <pic:spPr>
                     <a:xfrm>
                       <a:off x="0" y="0"/>
-                      <a:ext cx="2267996" cy="2460044"/>
+                      <a:ext cx="2869195" cy="3112151"/>
                     </a:xfrm>
                     <a:prstGeom prst="rect"/>
                   </pic:spPr>
@@ -7065,7 +7090,7 @@
       <w:r>
         <w:drawing>
           <wp:inline xmlns:a="http://schemas.openxmlformats.org/drawingml/2006/main" xmlns:pic="http://schemas.openxmlformats.org/drawingml/2006/picture">
-            <wp:extent cx="2161028" cy="2974842"/>
+            <wp:extent cx="1673997" cy="2304402"/>
             <wp:docPr id="15" name="Picture 15"/>
             <wp:cNvGraphicFramePr>
               <a:graphicFrameLocks noChangeAspect="1"/>
@@ -7086,7 +7111,7 @@
                   <pic:spPr>
                     <a:xfrm>
                       <a:off x="0" y="0"/>
-                      <a:ext cx="2161028" cy="2974842"/>
+                      <a:ext cx="1673997" cy="2304402"/>
                     </a:xfrm>
                     <a:prstGeom prst="rect"/>
                   </pic:spPr>
@@ -7438,7 +7463,7 @@
       <w:r>
         <w:drawing>
           <wp:inline xmlns:a="http://schemas.openxmlformats.org/drawingml/2006/main" xmlns:pic="http://schemas.openxmlformats.org/drawingml/2006/picture">
-            <wp:extent cx="1655997" cy="2087808"/>
+            <wp:extent cx="1861197" cy="2346516"/>
             <wp:docPr id="16" name="Picture 16"/>
             <wp:cNvGraphicFramePr>
               <a:graphicFrameLocks noChangeAspect="1"/>
@@ -7459,7 +7484,7 @@
                   <pic:spPr>
                     <a:xfrm>
                       <a:off x="0" y="0"/>
-                      <a:ext cx="1655997" cy="2087808"/>
+                      <a:ext cx="1861197" cy="2346516"/>
                     </a:xfrm>
                     <a:prstGeom prst="rect"/>
                   </pic:spPr>
@@ -7735,7 +7760,7 @@
       <w:r>
         <w:drawing>
           <wp:inline xmlns:a="http://schemas.openxmlformats.org/drawingml/2006/main" xmlns:pic="http://schemas.openxmlformats.org/drawingml/2006/picture">
-            <wp:extent cx="2699995" cy="1317336"/>
+            <wp:extent cx="3095995" cy="1510546"/>
             <wp:docPr id="17" name="Picture 17"/>
             <wp:cNvGraphicFramePr>
               <a:graphicFrameLocks noChangeAspect="1"/>
@@ -7756,7 +7781,7 @@
                   <pic:spPr>
                     <a:xfrm>
                       <a:off x="0" y="0"/>
-                      <a:ext cx="2699995" cy="1317336"/>
+                      <a:ext cx="3095995" cy="1510546"/>
                     </a:xfrm>
                     <a:prstGeom prst="rect"/>
                   </pic:spPr>
@@ -8030,7 +8055,7 @@
       <w:r>
         <w:drawing>
           <wp:inline xmlns:a="http://schemas.openxmlformats.org/drawingml/2006/main" xmlns:pic="http://schemas.openxmlformats.org/drawingml/2006/picture">
-            <wp:extent cx="1079998" cy="2101005"/>
+            <wp:extent cx="1259998" cy="2451173"/>
             <wp:docPr id="18" name="Picture 18"/>
             <wp:cNvGraphicFramePr>
               <a:graphicFrameLocks noChangeAspect="1"/>
@@ -8051,7 +8076,7 @@
                   <pic:spPr>
                     <a:xfrm>
                       <a:off x="0" y="0"/>
-                      <a:ext cx="1079998" cy="2101005"/>
+                      <a:ext cx="1259998" cy="2451173"/>
                     </a:xfrm>
                     <a:prstGeom prst="rect"/>
                   </pic:spPr>
@@ -8174,11 +8199,11 @@
         <w:tblLook w:firstColumn="1" w:firstRow="1" w:lastColumn="0" w:lastRow="0" w:noHBand="0" w:noVBand="1" w:val="04A0"/>
         <w:tblBorders>
           <w:top w:val="single" w:sz="4" w:space="0" w:color="D1D5DB"/>
-          <w:left w:val="none"/>
+          <w:left w:val="single" w:sz="4" w:space="0" w:color="D1D5DB"/>
           <w:bottom w:val="single" w:sz="4" w:space="0" w:color="D1D5DB"/>
-          <w:right w:val="none"/>
+          <w:right w:val="single" w:sz="4" w:space="0" w:color="D1D5DB"/>
           <w:insideH w:val="single" w:sz="4" w:space="0" w:color="D1D5DB"/>
-          <w:insideV w:val="none"/>
+          <w:insideV w:val="single" w:sz="4" w:space="0" w:color="D1D5DB"/>
         </w:tblBorders>
       </w:tblPr>
       <w:tblGrid>
@@ -8665,7 +8690,7 @@
     <w:p>
       <w:pPr>
         <w:spacing w:before="20" w:after="60" w:line="276" w:lineRule="auto"/>
-        <w:ind w:left="283"/>
+        <w:ind w:left="454"/>
       </w:pPr>
       <w:r>
         <w:rPr>
@@ -8701,7 +8726,7 @@
     <w:p>
       <w:pPr>
         <w:spacing w:before="20" w:after="60" w:line="276" w:lineRule="auto"/>
-        <w:ind w:left="283"/>
+        <w:ind w:left="454"/>
       </w:pPr>
       <w:r>
         <w:rPr>
@@ -8757,7 +8782,7 @@
     <w:p>
       <w:pPr>
         <w:spacing w:before="20" w:after="60" w:line="276" w:lineRule="auto"/>
-        <w:ind w:left="283"/>
+        <w:ind w:left="454"/>
       </w:pPr>
       <w:r>
         <w:rPr>
@@ -8813,7 +8838,7 @@
     <w:p>
       <w:pPr>
         <w:spacing w:before="20" w:after="60" w:line="276" w:lineRule="auto"/>
-        <w:ind w:left="283"/>
+        <w:ind w:left="454"/>
       </w:pPr>
       <w:r>
         <w:rPr>
@@ -8915,7 +8940,7 @@
       <w:r>
         <w:drawing>
           <wp:inline xmlns:a="http://schemas.openxmlformats.org/drawingml/2006/main" xmlns:pic="http://schemas.openxmlformats.org/drawingml/2006/picture">
-            <wp:extent cx="4700008" cy="2666995"/>
+            <wp:extent cx="5345991" cy="3033555"/>
             <wp:docPr id="19" name="Picture 19"/>
             <wp:cNvGraphicFramePr>
               <a:graphicFrameLocks noChangeAspect="1"/>
@@ -8936,7 +8961,7 @@
                   <pic:spPr>
                     <a:xfrm>
                       <a:off x="0" y="0"/>
-                      <a:ext cx="4700008" cy="2666995"/>
+                      <a:ext cx="5345991" cy="3033555"/>
                     </a:xfrm>
                     <a:prstGeom prst="rect"/>
                   </pic:spPr>
@@ -9151,82 +9176,6 @@
     </w:p>
     <w:p>
       <w:pPr>
-        <w:spacing w:before="20" w:after="60" w:line="276" w:lineRule="auto"/>
-        <w:ind w:left="283"/>
-      </w:pPr>
-      <w:r>
-        <w:rPr>
-          <w:rFonts w:ascii="Times New Roman" w:hAnsi="Times New Roman"/>
-          <w:b w:val="0"/>
-          <w:i w:val="0"/>
-          <w:color w:val="111827"/>
-          <w:sz w:val="21"/>
-        </w:rPr>
-        <w:t xml:space="preserve">•  </w:t>
-      </w:r>
-      <w:r>
-        <w:rPr>
-          <w:rFonts w:ascii="Times New Roman" w:hAnsi="Times New Roman"/>
-          <w:b/>
-          <w:i w:val="0"/>
-          <w:color w:val="111827"/>
-          <w:sz w:val="21"/>
-        </w:rPr>
-        <w:t>Examples:</w:t>
-      </w:r>
-      <w:r>
-        <w:rPr>
-          <w:rFonts w:ascii="Times New Roman" w:hAnsi="Times New Roman"/>
-          <w:b w:val="0"/>
-          <w:i w:val="0"/>
-          <w:color w:val="111827"/>
-          <w:sz w:val="21"/>
-        </w:rPr>
-        <w:t xml:space="preserve"> </w:t>
-      </w:r>
-      <w:r>
-        <w:rPr>
-          <w:rFonts w:ascii="Times New Roman" w:hAnsi="Times New Roman"/>
-          <w:b w:val="0"/>
-          <w:i/>
-          <w:color w:val="111827"/>
-          <w:sz w:val="21"/>
-        </w:rPr>
-        <w:t>Petromyzon</w:t>
-      </w:r>
-      <w:r>
-        <w:rPr>
-          <w:rFonts w:ascii="Times New Roman" w:hAnsi="Times New Roman"/>
-          <w:b w:val="0"/>
-          <w:i w:val="0"/>
-          <w:color w:val="111827"/>
-          <w:sz w:val="21"/>
-        </w:rPr>
-        <w:t xml:space="preserve"> (Lamprey) and </w:t>
-      </w:r>
-      <w:r>
-        <w:rPr>
-          <w:rFonts w:ascii="Times New Roman" w:hAnsi="Times New Roman"/>
-          <w:b w:val="0"/>
-          <w:i/>
-          <w:color w:val="111827"/>
-          <w:sz w:val="21"/>
-        </w:rPr>
-        <w:t>Myxine</w:t>
-      </w:r>
-      <w:r>
-        <w:rPr>
-          <w:rFonts w:ascii="Times New Roman" w:hAnsi="Times New Roman"/>
-          <w:b w:val="0"/>
-          <w:i w:val="0"/>
-          <w:color w:val="111827"/>
-          <w:sz w:val="21"/>
-        </w:rPr>
-        <w:t xml:space="preserve"> (Hagfish).</w:t>
-      </w:r>
-    </w:p>
-    <w:p>
-      <w:pPr>
         <w:keepNext/>
         <w:spacing w:before="120" w:after="40"/>
         <w:jc w:val="center"/>
@@ -9234,7 +9183,7 @@
       <w:r>
         <w:drawing>
           <wp:inline xmlns:a="http://schemas.openxmlformats.org/drawingml/2006/main" xmlns:pic="http://schemas.openxmlformats.org/drawingml/2006/picture">
-            <wp:extent cx="2519996" cy="798244"/>
+            <wp:extent cx="3779994" cy="1197367"/>
             <wp:docPr id="20" name="Picture 20"/>
             <wp:cNvGraphicFramePr>
               <a:graphicFrameLocks noChangeAspect="1"/>
@@ -9255,7 +9204,7 @@
                   <pic:spPr>
                     <a:xfrm>
                       <a:off x="0" y="0"/>
-                      <a:ext cx="2519996" cy="798244"/>
+                      <a:ext cx="3779994" cy="1197367"/>
                     </a:xfrm>
                     <a:prstGeom prst="rect"/>
                   </pic:spPr>
@@ -9719,7 +9668,7 @@
       <w:r>
         <w:drawing>
           <wp:inline xmlns:a="http://schemas.openxmlformats.org/drawingml/2006/main" xmlns:pic="http://schemas.openxmlformats.org/drawingml/2006/picture">
-            <wp:extent cx="2879995" cy="2108067"/>
+            <wp:extent cx="2570396" cy="1881450"/>
             <wp:docPr id="21" name="Picture 21"/>
             <wp:cNvGraphicFramePr>
               <a:graphicFrameLocks noChangeAspect="1"/>
@@ -9740,7 +9689,7 @@
                   <pic:spPr>
                     <a:xfrm>
                       <a:off x="0" y="0"/>
-                      <a:ext cx="2879995" cy="2108067"/>
+                      <a:ext cx="2570396" cy="1881450"/>
                     </a:xfrm>
                     <a:prstGeom prst="rect"/>
                   </pic:spPr>
@@ -10581,7 +10530,7 @@
       <w:r>
         <w:drawing>
           <wp:inline xmlns:a="http://schemas.openxmlformats.org/drawingml/2006/main" xmlns:pic="http://schemas.openxmlformats.org/drawingml/2006/picture">
-            <wp:extent cx="1871997" cy="2158410"/>
+            <wp:extent cx="1832397" cy="2112751"/>
             <wp:docPr id="23" name="Picture 23"/>
             <wp:cNvGraphicFramePr>
               <a:graphicFrameLocks noChangeAspect="1"/>
@@ -10602,7 +10551,7 @@
                   <pic:spPr>
                     <a:xfrm>
                       <a:off x="0" y="0"/>
-                      <a:ext cx="1871997" cy="2158410"/>
+                      <a:ext cx="1832397" cy="2112751"/>
                     </a:xfrm>
                     <a:prstGeom prst="rect"/>
                   </pic:spPr>
@@ -11110,7 +11059,7 @@
       <w:r>
         <w:drawing>
           <wp:inline xmlns:a="http://schemas.openxmlformats.org/drawingml/2006/main" xmlns:pic="http://schemas.openxmlformats.org/drawingml/2006/picture">
-            <wp:extent cx="3599994" cy="1375718"/>
+            <wp:extent cx="3995993" cy="1527047"/>
             <wp:docPr id="24" name="Picture 24"/>
             <wp:cNvGraphicFramePr>
               <a:graphicFrameLocks noChangeAspect="1"/>
@@ -11131,7 +11080,7 @@
                   <pic:spPr>
                     <a:xfrm>
                       <a:off x="0" y="0"/>
-                      <a:ext cx="3599994" cy="1375718"/>
+                      <a:ext cx="3995993" cy="1527047"/>
                     </a:xfrm>
                     <a:prstGeom prst="rect"/>
                   </pic:spPr>
@@ -11635,7 +11584,7 @@
       <w:r>
         <w:drawing>
           <wp:inline xmlns:a="http://schemas.openxmlformats.org/drawingml/2006/main" xmlns:pic="http://schemas.openxmlformats.org/drawingml/2006/picture">
-            <wp:extent cx="3599994" cy="1302416"/>
+            <wp:extent cx="4881592" cy="1766076"/>
             <wp:docPr id="25" name="Picture 25"/>
             <wp:cNvGraphicFramePr>
               <a:graphicFrameLocks noChangeAspect="1"/>
@@ -11656,7 +11605,7 @@
                   <pic:spPr>
                     <a:xfrm>
                       <a:off x="0" y="0"/>
-                      <a:ext cx="3599994" cy="1302416"/>
+                      <a:ext cx="4881592" cy="1766076"/>
                     </a:xfrm>
                     <a:prstGeom prst="rect"/>
                   </pic:spPr>
@@ -12244,7 +12193,7 @@
       <w:r>
         <w:drawing>
           <wp:inline xmlns:a="http://schemas.openxmlformats.org/drawingml/2006/main" xmlns:pic="http://schemas.openxmlformats.org/drawingml/2006/picture">
-            <wp:extent cx="3599994" cy="1313062"/>
+            <wp:extent cx="4708792" cy="1717486"/>
             <wp:docPr id="26" name="Picture 26"/>
             <wp:cNvGraphicFramePr>
               <a:graphicFrameLocks noChangeAspect="1"/>
@@ -12265,7 +12214,7 @@
                   <pic:spPr>
                     <a:xfrm>
                       <a:off x="0" y="0"/>
-                      <a:ext cx="3599994" cy="1313062"/>
+                      <a:ext cx="4708792" cy="1717486"/>
                     </a:xfrm>
                     <a:prstGeom prst="rect"/>
                   </pic:spPr>
@@ -12300,6 +12249,11 @@
           <w:sz w:val="18"/>
         </w:rPr>
         <w:t xml:space="preserve"> - Some mammals : (a) Ornithorhynchus (b) Macropus (c) Pteropus (d) Balaenoptera.</w:t>
+      </w:r>
+    </w:p>
+    <w:p>
+      <w:r>
+        <w:br w:type="page"/>
       </w:r>
     </w:p>
     <w:p>
@@ -12352,23 +12306,23 @@
         <w:tblLook w:firstColumn="1" w:firstRow="1" w:lastColumn="0" w:lastRow="0" w:noHBand="0" w:noVBand="1" w:val="04A0"/>
         <w:tblBorders>
           <w:top w:val="single" w:sz="4" w:space="0" w:color="D1D5DB"/>
-          <w:left w:val="none"/>
+          <w:left w:val="single" w:sz="4" w:space="0" w:color="D1D5DB"/>
           <w:bottom w:val="single" w:sz="4" w:space="0" w:color="D1D5DB"/>
-          <w:right w:val="none"/>
+          <w:right w:val="single" w:sz="4" w:space="0" w:color="D1D5DB"/>
           <w:insideH w:val="single" w:sz="4" w:space="0" w:color="D1D5DB"/>
-          <w:insideV w:val="none"/>
+          <w:insideV w:val="single" w:sz="4" w:space="0" w:color="D1D5DB"/>
         </w:tblBorders>
       </w:tblPr>
       <w:tblGrid>
-        <w:gridCol w:w="1134"/>
-        <w:gridCol w:w="1134"/>
-        <w:gridCol w:w="1134"/>
-        <w:gridCol w:w="1134"/>
-        <w:gridCol w:w="1134"/>
-        <w:gridCol w:w="1134"/>
-        <w:gridCol w:w="1134"/>
-        <w:gridCol w:w="1134"/>
-        <w:gridCol w:w="1134"/>
+        <w:gridCol w:w="1174"/>
+        <w:gridCol w:w="1225"/>
+        <w:gridCol w:w="867"/>
+        <w:gridCol w:w="1071"/>
+        <w:gridCol w:w="969"/>
+        <w:gridCol w:w="1071"/>
+        <w:gridCol w:w="918"/>
+        <w:gridCol w:w="918"/>
+        <w:gridCol w:w="1990"/>
       </w:tblGrid>
       <w:tr>
         <w:trPr>
@@ -12377,7 +12331,7 @@
         </w:trPr>
         <w:tc>
           <w:tcPr>
-            <w:tcW w:type="dxa" w:w="1134"/>
+            <w:tcW w:type="dxa" w:w="1174"/>
             <w:vAlign w:val="center"/>
             <w:shd w:fill="1F2937"/>
             <w:tcMar>
@@ -12406,7 +12360,7 @@
         </w:tc>
         <w:tc>
           <w:tcPr>
-            <w:tcW w:type="dxa" w:w="1134"/>
+            <w:tcW w:type="dxa" w:w="1225"/>
             <w:vAlign w:val="center"/>
             <w:shd w:fill="1F2937"/>
             <w:tcMar>
@@ -12435,7 +12389,7 @@
         </w:tc>
         <w:tc>
           <w:tcPr>
-            <w:tcW w:type="dxa" w:w="1134"/>
+            <w:tcW w:type="dxa" w:w="867"/>
             <w:vAlign w:val="center"/>
             <w:shd w:fill="1F2937"/>
             <w:tcMar>
@@ -12464,7 +12418,7 @@
         </w:tc>
         <w:tc>
           <w:tcPr>
-            <w:tcW w:type="dxa" w:w="1134"/>
+            <w:tcW w:type="dxa" w:w="1071"/>
             <w:vAlign w:val="center"/>
             <w:shd w:fill="1F2937"/>
             <w:tcMar>
@@ -12493,7 +12447,7 @@
         </w:tc>
         <w:tc>
           <w:tcPr>
-            <w:tcW w:type="dxa" w:w="1134"/>
+            <w:tcW w:type="dxa" w:w="969"/>
             <w:vAlign w:val="center"/>
             <w:shd w:fill="1F2937"/>
             <w:tcMar>
@@ -12522,7 +12476,7 @@
         </w:tc>
         <w:tc>
           <w:tcPr>
-            <w:tcW w:type="dxa" w:w="1134"/>
+            <w:tcW w:type="dxa" w:w="1071"/>
             <w:vAlign w:val="center"/>
             <w:shd w:fill="1F2937"/>
             <w:tcMar>
@@ -12551,7 +12505,7 @@
         </w:tc>
         <w:tc>
           <w:tcPr>
-            <w:tcW w:type="dxa" w:w="1134"/>
+            <w:tcW w:type="dxa" w:w="918"/>
             <w:vAlign w:val="center"/>
             <w:shd w:fill="1F2937"/>
             <w:tcMar>
@@ -12580,7 +12534,7 @@
         </w:tc>
         <w:tc>
           <w:tcPr>
-            <w:tcW w:type="dxa" w:w="1134"/>
+            <w:tcW w:type="dxa" w:w="918"/>
             <w:vAlign w:val="center"/>
             <w:shd w:fill="1F2937"/>
             <w:tcMar>
@@ -12609,7 +12563,7 @@
         </w:tc>
         <w:tc>
           <w:tcPr>
-            <w:tcW w:type="dxa" w:w="1134"/>
+            <w:tcW w:type="dxa" w:w="1990"/>
             <w:vAlign w:val="center"/>
             <w:shd w:fill="1F2937"/>
             <w:tcMar>
@@ -12643,7 +12597,7 @@
         </w:trPr>
         <w:tc>
           <w:tcPr>
-            <w:tcW w:type="dxa" w:w="1134"/>
+            <w:tcW w:type="dxa" w:w="1174"/>
             <w:vAlign w:val="center"/>
             <w:shd w:fill="F3F4F6"/>
             <w:tcMar>
@@ -12672,7 +12626,7 @@
         </w:tc>
         <w:tc>
           <w:tcPr>
-            <w:tcW w:type="dxa" w:w="1134"/>
+            <w:tcW w:type="dxa" w:w="1225"/>
             <w:vAlign w:val="center"/>
             <w:shd w:fill="F3F4F6"/>
             <w:tcMar>
@@ -12701,7 +12655,7 @@
         </w:tc>
         <w:tc>
           <w:tcPr>
-            <w:tcW w:type="dxa" w:w="1134"/>
+            <w:tcW w:type="dxa" w:w="867"/>
             <w:vAlign w:val="center"/>
             <w:shd w:fill="F3F4F6"/>
             <w:tcMar>
@@ -12730,7 +12684,7 @@
         </w:tc>
         <w:tc>
           <w:tcPr>
-            <w:tcW w:type="dxa" w:w="1134"/>
+            <w:tcW w:type="dxa" w:w="1071"/>
             <w:vAlign w:val="center"/>
             <w:shd w:fill="F3F4F6"/>
             <w:tcMar>
@@ -12759,7 +12713,7 @@
         </w:tc>
         <w:tc>
           <w:tcPr>
-            <w:tcW w:type="dxa" w:w="1134"/>
+            <w:tcW w:type="dxa" w:w="969"/>
             <w:vAlign w:val="center"/>
             <w:shd w:fill="F3F4F6"/>
             <w:tcMar>
@@ -12788,7 +12742,7 @@
         </w:tc>
         <w:tc>
           <w:tcPr>
-            <w:tcW w:type="dxa" w:w="1134"/>
+            <w:tcW w:type="dxa" w:w="1071"/>
             <w:vAlign w:val="center"/>
             <w:shd w:fill="F3F4F6"/>
             <w:tcMar>
@@ -12817,7 +12771,7 @@
         </w:tc>
         <w:tc>
           <w:tcPr>
-            <w:tcW w:type="dxa" w:w="1134"/>
+            <w:tcW w:type="dxa" w:w="918"/>
             <w:vAlign w:val="center"/>
             <w:shd w:fill="F3F4F6"/>
             <w:tcMar>
@@ -12846,7 +12800,7 @@
         </w:tc>
         <w:tc>
           <w:tcPr>
-            <w:tcW w:type="dxa" w:w="1134"/>
+            <w:tcW w:type="dxa" w:w="918"/>
             <w:vAlign w:val="center"/>
             <w:shd w:fill="F3F4F6"/>
             <w:tcMar>
@@ -12875,7 +12829,7 @@
         </w:tc>
         <w:tc>
           <w:tcPr>
-            <w:tcW w:type="dxa" w:w="1134"/>
+            <w:tcW w:type="dxa" w:w="1990"/>
             <w:vAlign w:val="center"/>
             <w:shd w:fill="F3F4F6"/>
             <w:tcMar>
@@ -12909,7 +12863,7 @@
         </w:trPr>
         <w:tc>
           <w:tcPr>
-            <w:tcW w:type="dxa" w:w="1134"/>
+            <w:tcW w:type="dxa" w:w="1174"/>
             <w:vAlign w:val="center"/>
             <w:shd w:fill="FFFFFF"/>
             <w:tcMar>
@@ -12938,7 +12892,7 @@
         </w:tc>
         <w:tc>
           <w:tcPr>
-            <w:tcW w:type="dxa" w:w="1134"/>
+            <w:tcW w:type="dxa" w:w="1225"/>
             <w:vAlign w:val="center"/>
             <w:shd w:fill="FFFFFF"/>
             <w:tcMar>
@@ -12967,7 +12921,7 @@
         </w:tc>
         <w:tc>
           <w:tcPr>
-            <w:tcW w:type="dxa" w:w="1134"/>
+            <w:tcW w:type="dxa" w:w="867"/>
             <w:vAlign w:val="center"/>
             <w:shd w:fill="FFFFFF"/>
             <w:tcMar>
@@ -12996,7 +12950,7 @@
         </w:tc>
         <w:tc>
           <w:tcPr>
-            <w:tcW w:type="dxa" w:w="1134"/>
+            <w:tcW w:type="dxa" w:w="1071"/>
             <w:vAlign w:val="center"/>
             <w:shd w:fill="FFFFFF"/>
             <w:tcMar>
@@ -13025,7 +12979,7 @@
         </w:tc>
         <w:tc>
           <w:tcPr>
-            <w:tcW w:type="dxa" w:w="1134"/>
+            <w:tcW w:type="dxa" w:w="969"/>
             <w:vAlign w:val="center"/>
             <w:shd w:fill="FFFFFF"/>
             <w:tcMar>
@@ -13054,7 +13008,7 @@
         </w:tc>
         <w:tc>
           <w:tcPr>
-            <w:tcW w:type="dxa" w:w="1134"/>
+            <w:tcW w:type="dxa" w:w="1071"/>
             <w:vAlign w:val="center"/>
             <w:shd w:fill="FFFFFF"/>
             <w:tcMar>
@@ -13083,7 +13037,7 @@
         </w:tc>
         <w:tc>
           <w:tcPr>
-            <w:tcW w:type="dxa" w:w="1134"/>
+            <w:tcW w:type="dxa" w:w="918"/>
             <w:vAlign w:val="center"/>
             <w:shd w:fill="FFFFFF"/>
             <w:tcMar>
@@ -13112,7 +13066,7 @@
         </w:tc>
         <w:tc>
           <w:tcPr>
-            <w:tcW w:type="dxa" w:w="1134"/>
+            <w:tcW w:type="dxa" w:w="918"/>
             <w:vAlign w:val="center"/>
             <w:shd w:fill="FFFFFF"/>
             <w:tcMar>
@@ -13141,7 +13095,7 @@
         </w:tc>
         <w:tc>
           <w:tcPr>
-            <w:tcW w:type="dxa" w:w="1134"/>
+            <w:tcW w:type="dxa" w:w="1990"/>
             <w:vAlign w:val="center"/>
             <w:shd w:fill="FFFFFF"/>
             <w:tcMar>
@@ -13175,7 +13129,7 @@
         </w:trPr>
         <w:tc>
           <w:tcPr>
-            <w:tcW w:type="dxa" w:w="1134"/>
+            <w:tcW w:type="dxa" w:w="1174"/>
             <w:vAlign w:val="center"/>
             <w:shd w:fill="F3F4F6"/>
             <w:tcMar>
@@ -13204,7 +13158,7 @@
         </w:tc>
         <w:tc>
           <w:tcPr>
-            <w:tcW w:type="dxa" w:w="1134"/>
+            <w:tcW w:type="dxa" w:w="1225"/>
             <w:vAlign w:val="center"/>
             <w:shd w:fill="F3F4F6"/>
             <w:tcMar>
@@ -13233,7 +13187,7 @@
         </w:tc>
         <w:tc>
           <w:tcPr>
-            <w:tcW w:type="dxa" w:w="1134"/>
+            <w:tcW w:type="dxa" w:w="867"/>
             <w:vAlign w:val="center"/>
             <w:shd w:fill="F3F4F6"/>
             <w:tcMar>
@@ -13262,7 +13216,7 @@
         </w:tc>
         <w:tc>
           <w:tcPr>
-            <w:tcW w:type="dxa" w:w="1134"/>
+            <w:tcW w:type="dxa" w:w="1071"/>
             <w:vAlign w:val="center"/>
             <w:shd w:fill="F3F4F6"/>
             <w:tcMar>
@@ -13291,7 +13245,7 @@
         </w:tc>
         <w:tc>
           <w:tcPr>
-            <w:tcW w:type="dxa" w:w="1134"/>
+            <w:tcW w:type="dxa" w:w="969"/>
             <w:vAlign w:val="center"/>
             <w:shd w:fill="F3F4F6"/>
             <w:tcMar>
@@ -13320,7 +13274,7 @@
         </w:tc>
         <w:tc>
           <w:tcPr>
-            <w:tcW w:type="dxa" w:w="1134"/>
+            <w:tcW w:type="dxa" w:w="1071"/>
             <w:vAlign w:val="center"/>
             <w:shd w:fill="F3F4F6"/>
             <w:tcMar>
@@ -13349,7 +13303,7 @@
         </w:tc>
         <w:tc>
           <w:tcPr>
-            <w:tcW w:type="dxa" w:w="1134"/>
+            <w:tcW w:type="dxa" w:w="918"/>
             <w:vAlign w:val="center"/>
             <w:shd w:fill="F3F4F6"/>
             <w:tcMar>
@@ -13378,7 +13332,7 @@
         </w:tc>
         <w:tc>
           <w:tcPr>
-            <w:tcW w:type="dxa" w:w="1134"/>
+            <w:tcW w:type="dxa" w:w="918"/>
             <w:vAlign w:val="center"/>
             <w:shd w:fill="F3F4F6"/>
             <w:tcMar>
@@ -13407,7 +13361,7 @@
         </w:tc>
         <w:tc>
           <w:tcPr>
-            <w:tcW w:type="dxa" w:w="1134"/>
+            <w:tcW w:type="dxa" w:w="1990"/>
             <w:vAlign w:val="center"/>
             <w:shd w:fill="F3F4F6"/>
             <w:tcMar>
@@ -13441,7 +13395,7 @@
         </w:trPr>
         <w:tc>
           <w:tcPr>
-            <w:tcW w:type="dxa" w:w="1134"/>
+            <w:tcW w:type="dxa" w:w="1174"/>
             <w:vAlign w:val="center"/>
             <w:shd w:fill="FFFFFF"/>
             <w:tcMar>
@@ -13470,7 +13424,7 @@
         </w:tc>
         <w:tc>
           <w:tcPr>
-            <w:tcW w:type="dxa" w:w="1134"/>
+            <w:tcW w:type="dxa" w:w="1225"/>
             <w:vAlign w:val="center"/>
             <w:shd w:fill="FFFFFF"/>
             <w:tcMar>
@@ -13499,7 +13453,7 @@
         </w:tc>
         <w:tc>
           <w:tcPr>
-            <w:tcW w:type="dxa" w:w="1134"/>
+            <w:tcW w:type="dxa" w:w="867"/>
             <w:vAlign w:val="center"/>
             <w:shd w:fill="FFFFFF"/>
             <w:tcMar>
@@ -13528,7 +13482,7 @@
         </w:tc>
         <w:tc>
           <w:tcPr>
-            <w:tcW w:type="dxa" w:w="1134"/>
+            <w:tcW w:type="dxa" w:w="1071"/>
             <w:vAlign w:val="center"/>
             <w:shd w:fill="FFFFFF"/>
             <w:tcMar>
@@ -13557,7 +13511,7 @@
         </w:tc>
         <w:tc>
           <w:tcPr>
-            <w:tcW w:type="dxa" w:w="1134"/>
+            <w:tcW w:type="dxa" w:w="969"/>
             <w:vAlign w:val="center"/>
             <w:shd w:fill="FFFFFF"/>
             <w:tcMar>
@@ -13586,7 +13540,7 @@
         </w:tc>
         <w:tc>
           <w:tcPr>
-            <w:tcW w:type="dxa" w:w="1134"/>
+            <w:tcW w:type="dxa" w:w="1071"/>
             <w:vAlign w:val="center"/>
             <w:shd w:fill="FFFFFF"/>
             <w:tcMar>
@@ -13615,7 +13569,7 @@
         </w:tc>
         <w:tc>
           <w:tcPr>
-            <w:tcW w:type="dxa" w:w="1134"/>
+            <w:tcW w:type="dxa" w:w="918"/>
             <w:vAlign w:val="center"/>
             <w:shd w:fill="FFFFFF"/>
             <w:tcMar>
@@ -13644,7 +13598,7 @@
         </w:tc>
         <w:tc>
           <w:tcPr>
-            <w:tcW w:type="dxa" w:w="1134"/>
+            <w:tcW w:type="dxa" w:w="918"/>
             <w:vAlign w:val="center"/>
             <w:shd w:fill="FFFFFF"/>
             <w:tcMar>
@@ -13673,7 +13627,7 @@
         </w:tc>
         <w:tc>
           <w:tcPr>
-            <w:tcW w:type="dxa" w:w="1134"/>
+            <w:tcW w:type="dxa" w:w="1990"/>
             <w:vAlign w:val="center"/>
             <w:shd w:fill="FFFFFF"/>
             <w:tcMar>
@@ -13707,7 +13661,7 @@
         </w:trPr>
         <w:tc>
           <w:tcPr>
-            <w:tcW w:type="dxa" w:w="1134"/>
+            <w:tcW w:type="dxa" w:w="1174"/>
             <w:vAlign w:val="center"/>
             <w:shd w:fill="F3F4F6"/>
             <w:tcMar>
@@ -13736,7 +13690,7 @@
         </w:tc>
         <w:tc>
           <w:tcPr>
-            <w:tcW w:type="dxa" w:w="1134"/>
+            <w:tcW w:type="dxa" w:w="1225"/>
             <w:vAlign w:val="center"/>
             <w:shd w:fill="F3F4F6"/>
             <w:tcMar>
@@ -13765,7 +13719,7 @@
         </w:tc>
         <w:tc>
           <w:tcPr>
-            <w:tcW w:type="dxa" w:w="1134"/>
+            <w:tcW w:type="dxa" w:w="867"/>
             <w:vAlign w:val="center"/>
             <w:shd w:fill="F3F4F6"/>
             <w:tcMar>
@@ -13794,7 +13748,7 @@
         </w:tc>
         <w:tc>
           <w:tcPr>
-            <w:tcW w:type="dxa" w:w="1134"/>
+            <w:tcW w:type="dxa" w:w="1071"/>
             <w:vAlign w:val="center"/>
             <w:shd w:fill="F3F4F6"/>
             <w:tcMar>
@@ -13823,7 +13777,7 @@
         </w:tc>
         <w:tc>
           <w:tcPr>
-            <w:tcW w:type="dxa" w:w="1134"/>
+            <w:tcW w:type="dxa" w:w="969"/>
             <w:vAlign w:val="center"/>
             <w:shd w:fill="F3F4F6"/>
             <w:tcMar>
@@ -13852,7 +13806,7 @@
         </w:tc>
         <w:tc>
           <w:tcPr>
-            <w:tcW w:type="dxa" w:w="1134"/>
+            <w:tcW w:type="dxa" w:w="1071"/>
             <w:vAlign w:val="center"/>
             <w:shd w:fill="F3F4F6"/>
             <w:tcMar>
@@ -13881,7 +13835,7 @@
         </w:tc>
         <w:tc>
           <w:tcPr>
-            <w:tcW w:type="dxa" w:w="1134"/>
+            <w:tcW w:type="dxa" w:w="918"/>
             <w:vAlign w:val="center"/>
             <w:shd w:fill="F3F4F6"/>
             <w:tcMar>
@@ -13910,7 +13864,7 @@
         </w:tc>
         <w:tc>
           <w:tcPr>
-            <w:tcW w:type="dxa" w:w="1134"/>
+            <w:tcW w:type="dxa" w:w="918"/>
             <w:vAlign w:val="center"/>
             <w:shd w:fill="F3F4F6"/>
             <w:tcMar>
@@ -13939,7 +13893,7 @@
         </w:tc>
         <w:tc>
           <w:tcPr>
-            <w:tcW w:type="dxa" w:w="1134"/>
+            <w:tcW w:type="dxa" w:w="1990"/>
             <w:vAlign w:val="center"/>
             <w:shd w:fill="F3F4F6"/>
             <w:tcMar>
@@ -13973,7 +13927,7 @@
         </w:trPr>
         <w:tc>
           <w:tcPr>
-            <w:tcW w:type="dxa" w:w="1134"/>
+            <w:tcW w:type="dxa" w:w="1174"/>
             <w:vAlign w:val="center"/>
             <w:shd w:fill="FFFFFF"/>
             <w:tcMar>
@@ -14002,7 +13956,7 @@
         </w:tc>
         <w:tc>
           <w:tcPr>
-            <w:tcW w:type="dxa" w:w="1134"/>
+            <w:tcW w:type="dxa" w:w="1225"/>
             <w:vAlign w:val="center"/>
             <w:shd w:fill="FFFFFF"/>
             <w:tcMar>
@@ -14031,7 +13985,7 @@
         </w:tc>
         <w:tc>
           <w:tcPr>
-            <w:tcW w:type="dxa" w:w="1134"/>
+            <w:tcW w:type="dxa" w:w="867"/>
             <w:vAlign w:val="center"/>
             <w:shd w:fill="FFFFFF"/>
             <w:tcMar>
@@ -14060,7 +14014,7 @@
         </w:tc>
         <w:tc>
           <w:tcPr>
-            <w:tcW w:type="dxa" w:w="1134"/>
+            <w:tcW w:type="dxa" w:w="1071"/>
             <w:vAlign w:val="center"/>
             <w:shd w:fill="FFFFFF"/>
             <w:tcMar>
@@ -14089,7 +14043,7 @@
         </w:tc>
         <w:tc>
           <w:tcPr>
-            <w:tcW w:type="dxa" w:w="1134"/>
+            <w:tcW w:type="dxa" w:w="969"/>
             <w:vAlign w:val="center"/>
             <w:shd w:fill="FFFFFF"/>
             <w:tcMar>
@@ -14118,7 +14072,7 @@
         </w:tc>
         <w:tc>
           <w:tcPr>
-            <w:tcW w:type="dxa" w:w="1134"/>
+            <w:tcW w:type="dxa" w:w="1071"/>
             <w:vAlign w:val="center"/>
             <w:shd w:fill="FFFFFF"/>
             <w:tcMar>
@@ -14147,7 +14101,7 @@
         </w:tc>
         <w:tc>
           <w:tcPr>
-            <w:tcW w:type="dxa" w:w="1134"/>
+            <w:tcW w:type="dxa" w:w="918"/>
             <w:vAlign w:val="center"/>
             <w:shd w:fill="FFFFFF"/>
             <w:tcMar>
@@ -14176,7 +14130,7 @@
         </w:tc>
         <w:tc>
           <w:tcPr>
-            <w:tcW w:type="dxa" w:w="1134"/>
+            <w:tcW w:type="dxa" w:w="918"/>
             <w:vAlign w:val="center"/>
             <w:shd w:fill="FFFFFF"/>
             <w:tcMar>
@@ -14205,7 +14159,7 @@
         </w:tc>
         <w:tc>
           <w:tcPr>
-            <w:tcW w:type="dxa" w:w="1134"/>
+            <w:tcW w:type="dxa" w:w="1990"/>
             <w:vAlign w:val="center"/>
             <w:shd w:fill="FFFFFF"/>
             <w:tcMar>
@@ -14239,7 +14193,7 @@
         </w:trPr>
         <w:tc>
           <w:tcPr>
-            <w:tcW w:type="dxa" w:w="1134"/>
+            <w:tcW w:type="dxa" w:w="1174"/>
             <w:vAlign w:val="center"/>
             <w:shd w:fill="F3F4F6"/>
             <w:tcMar>
@@ -14268,7 +14222,7 @@
         </w:tc>
         <w:tc>
           <w:tcPr>
-            <w:tcW w:type="dxa" w:w="1134"/>
+            <w:tcW w:type="dxa" w:w="1225"/>
             <w:vAlign w:val="center"/>
             <w:shd w:fill="F3F4F6"/>
             <w:tcMar>
@@ -14297,7 +14251,7 @@
         </w:tc>
         <w:tc>
           <w:tcPr>
-            <w:tcW w:type="dxa" w:w="1134"/>
+            <w:tcW w:type="dxa" w:w="867"/>
             <w:vAlign w:val="center"/>
             <w:shd w:fill="F3F4F6"/>
             <w:tcMar>
@@ -14326,7 +14280,7 @@
         </w:tc>
         <w:tc>
           <w:tcPr>
-            <w:tcW w:type="dxa" w:w="1134"/>
+            <w:tcW w:type="dxa" w:w="1071"/>
             <w:vAlign w:val="center"/>
             <w:shd w:fill="F3F4F6"/>
             <w:tcMar>
@@ -14355,7 +14309,7 @@
         </w:tc>
         <w:tc>
           <w:tcPr>
-            <w:tcW w:type="dxa" w:w="1134"/>
+            <w:tcW w:type="dxa" w:w="969"/>
             <w:vAlign w:val="center"/>
             <w:shd w:fill="F3F4F6"/>
             <w:tcMar>
@@ -14384,7 +14338,7 @@
         </w:tc>
         <w:tc>
           <w:tcPr>
-            <w:tcW w:type="dxa" w:w="1134"/>
+            <w:tcW w:type="dxa" w:w="1071"/>
             <w:vAlign w:val="center"/>
             <w:shd w:fill="F3F4F6"/>
             <w:tcMar>
@@ -14413,7 +14367,7 @@
         </w:tc>
         <w:tc>
           <w:tcPr>
-            <w:tcW w:type="dxa" w:w="1134"/>
+            <w:tcW w:type="dxa" w:w="918"/>
             <w:vAlign w:val="center"/>
             <w:shd w:fill="F3F4F6"/>
             <w:tcMar>
@@ -14442,7 +14396,7 @@
         </w:tc>
         <w:tc>
           <w:tcPr>
-            <w:tcW w:type="dxa" w:w="1134"/>
+            <w:tcW w:type="dxa" w:w="918"/>
             <w:vAlign w:val="center"/>
             <w:shd w:fill="F3F4F6"/>
             <w:tcMar>
@@ -14471,7 +14425,7 @@
         </w:tc>
         <w:tc>
           <w:tcPr>
-            <w:tcW w:type="dxa" w:w="1134"/>
+            <w:tcW w:type="dxa" w:w="1990"/>
             <w:vAlign w:val="center"/>
             <w:shd w:fill="F3F4F6"/>
             <w:tcMar>
@@ -14505,7 +14459,7 @@
         </w:trPr>
         <w:tc>
           <w:tcPr>
-            <w:tcW w:type="dxa" w:w="1134"/>
+            <w:tcW w:type="dxa" w:w="1174"/>
             <w:vAlign w:val="center"/>
             <w:shd w:fill="FFFFFF"/>
             <w:tcMar>
@@ -14534,7 +14488,7 @@
         </w:tc>
         <w:tc>
           <w:tcPr>
-            <w:tcW w:type="dxa" w:w="1134"/>
+            <w:tcW w:type="dxa" w:w="1225"/>
             <w:vAlign w:val="center"/>
             <w:shd w:fill="FFFFFF"/>
             <w:tcMar>
@@ -14563,7 +14517,7 @@
         </w:tc>
         <w:tc>
           <w:tcPr>
-            <w:tcW w:type="dxa" w:w="1134"/>
+            <w:tcW w:type="dxa" w:w="867"/>
             <w:vAlign w:val="center"/>
             <w:shd w:fill="FFFFFF"/>
             <w:tcMar>
@@ -14592,7 +14546,7 @@
         </w:tc>
         <w:tc>
           <w:tcPr>
-            <w:tcW w:type="dxa" w:w="1134"/>
+            <w:tcW w:type="dxa" w:w="1071"/>
             <w:vAlign w:val="center"/>
             <w:shd w:fill="FFFFFF"/>
             <w:tcMar>
@@ -14621,7 +14575,7 @@
         </w:tc>
         <w:tc>
           <w:tcPr>
-            <w:tcW w:type="dxa" w:w="1134"/>
+            <w:tcW w:type="dxa" w:w="969"/>
             <w:vAlign w:val="center"/>
             <w:shd w:fill="FFFFFF"/>
             <w:tcMar>
@@ -14650,7 +14604,7 @@
         </w:tc>
         <w:tc>
           <w:tcPr>
-            <w:tcW w:type="dxa" w:w="1134"/>
+            <w:tcW w:type="dxa" w:w="1071"/>
             <w:vAlign w:val="center"/>
             <w:shd w:fill="FFFFFF"/>
             <w:tcMar>
@@ -14679,7 +14633,7 @@
         </w:tc>
         <w:tc>
           <w:tcPr>
-            <w:tcW w:type="dxa" w:w="1134"/>
+            <w:tcW w:type="dxa" w:w="918"/>
             <w:vAlign w:val="center"/>
             <w:shd w:fill="FFFFFF"/>
             <w:tcMar>
@@ -14708,7 +14662,7 @@
         </w:tc>
         <w:tc>
           <w:tcPr>
-            <w:tcW w:type="dxa" w:w="1134"/>
+            <w:tcW w:type="dxa" w:w="918"/>
             <w:vAlign w:val="center"/>
             <w:shd w:fill="FFFFFF"/>
             <w:tcMar>
@@ -14737,7 +14691,7 @@
         </w:tc>
         <w:tc>
           <w:tcPr>
-            <w:tcW w:type="dxa" w:w="1134"/>
+            <w:tcW w:type="dxa" w:w="1990"/>
             <w:vAlign w:val="center"/>
             <w:shd w:fill="FFFFFF"/>
             <w:tcMar>
@@ -14771,7 +14725,7 @@
         </w:trPr>
         <w:tc>
           <w:tcPr>
-            <w:tcW w:type="dxa" w:w="1134"/>
+            <w:tcW w:type="dxa" w:w="1174"/>
             <w:vAlign w:val="center"/>
             <w:shd w:fill="F3F4F6"/>
             <w:tcMar>
@@ -14800,7 +14754,7 @@
         </w:tc>
         <w:tc>
           <w:tcPr>
-            <w:tcW w:type="dxa" w:w="1134"/>
+            <w:tcW w:type="dxa" w:w="1225"/>
             <w:vAlign w:val="center"/>
             <w:shd w:fill="F3F4F6"/>
             <w:tcMar>
@@ -14829,7 +14783,7 @@
         </w:tc>
         <w:tc>
           <w:tcPr>
-            <w:tcW w:type="dxa" w:w="1134"/>
+            <w:tcW w:type="dxa" w:w="867"/>
             <w:vAlign w:val="center"/>
             <w:shd w:fill="F3F4F6"/>
             <w:tcMar>
@@ -14858,7 +14812,7 @@
         </w:tc>
         <w:tc>
           <w:tcPr>
-            <w:tcW w:type="dxa" w:w="1134"/>
+            <w:tcW w:type="dxa" w:w="1071"/>
             <w:vAlign w:val="center"/>
             <w:shd w:fill="F3F4F6"/>
             <w:tcMar>
@@ -14887,7 +14841,7 @@
         </w:tc>
         <w:tc>
           <w:tcPr>
-            <w:tcW w:type="dxa" w:w="1134"/>
+            <w:tcW w:type="dxa" w:w="969"/>
             <w:vAlign w:val="center"/>
             <w:shd w:fill="F3F4F6"/>
             <w:tcMar>
@@ -14916,7 +14870,7 @@
         </w:tc>
         <w:tc>
           <w:tcPr>
-            <w:tcW w:type="dxa" w:w="1134"/>
+            <w:tcW w:type="dxa" w:w="1071"/>
             <w:vAlign w:val="center"/>
             <w:shd w:fill="F3F4F6"/>
             <w:tcMar>
@@ -14945,7 +14899,7 @@
         </w:tc>
         <w:tc>
           <w:tcPr>
-            <w:tcW w:type="dxa" w:w="1134"/>
+            <w:tcW w:type="dxa" w:w="918"/>
             <w:vAlign w:val="center"/>
             <w:shd w:fill="F3F4F6"/>
             <w:tcMar>
@@ -14974,7 +14928,7 @@
         </w:tc>
         <w:tc>
           <w:tcPr>
-            <w:tcW w:type="dxa" w:w="1134"/>
+            <w:tcW w:type="dxa" w:w="918"/>
             <w:vAlign w:val="center"/>
             <w:shd w:fill="F3F4F6"/>
             <w:tcMar>
@@ -15003,7 +14957,7 @@
         </w:tc>
         <w:tc>
           <w:tcPr>
-            <w:tcW w:type="dxa" w:w="1134"/>
+            <w:tcW w:type="dxa" w:w="1990"/>
             <w:vAlign w:val="center"/>
             <w:shd w:fill="F3F4F6"/>
             <w:tcMar>
@@ -15037,7 +14991,7 @@
         </w:trPr>
         <w:tc>
           <w:tcPr>
-            <w:tcW w:type="dxa" w:w="1134"/>
+            <w:tcW w:type="dxa" w:w="1174"/>
             <w:vAlign w:val="center"/>
             <w:shd w:fill="FFFFFF"/>
             <w:tcMar>
@@ -15066,7 +15020,7 @@
         </w:tc>
         <w:tc>
           <w:tcPr>
-            <w:tcW w:type="dxa" w:w="1134"/>
+            <w:tcW w:type="dxa" w:w="1225"/>
             <w:vAlign w:val="center"/>
             <w:shd w:fill="FFFFFF"/>
             <w:tcMar>
@@ -15095,7 +15049,7 @@
         </w:tc>
         <w:tc>
           <w:tcPr>
-            <w:tcW w:type="dxa" w:w="1134"/>
+            <w:tcW w:type="dxa" w:w="867"/>
             <w:vAlign w:val="center"/>
             <w:shd w:fill="FFFFFF"/>
             <w:tcMar>
@@ -15124,7 +15078,7 @@
         </w:tc>
         <w:tc>
           <w:tcPr>
-            <w:tcW w:type="dxa" w:w="1134"/>
+            <w:tcW w:type="dxa" w:w="1071"/>
             <w:vAlign w:val="center"/>
             <w:shd w:fill="FFFFFF"/>
             <w:tcMar>
@@ -15153,7 +15107,7 @@
         </w:tc>
         <w:tc>
           <w:tcPr>
-            <w:tcW w:type="dxa" w:w="1134"/>
+            <w:tcW w:type="dxa" w:w="969"/>
             <w:vAlign w:val="center"/>
             <w:shd w:fill="FFFFFF"/>
             <w:tcMar>
@@ -15182,7 +15136,7 @@
         </w:tc>
         <w:tc>
           <w:tcPr>
-            <w:tcW w:type="dxa" w:w="1134"/>
+            <w:tcW w:type="dxa" w:w="1071"/>
             <w:vAlign w:val="center"/>
             <w:shd w:fill="FFFFFF"/>
             <w:tcMar>
@@ -15211,7 +15165,7 @@
         </w:tc>
         <w:tc>
           <w:tcPr>
-            <w:tcW w:type="dxa" w:w="1134"/>
+            <w:tcW w:type="dxa" w:w="918"/>
             <w:vAlign w:val="center"/>
             <w:shd w:fill="FFFFFF"/>
             <w:tcMar>
@@ -15240,7 +15194,7 @@
         </w:tc>
         <w:tc>
           <w:tcPr>
-            <w:tcW w:type="dxa" w:w="1134"/>
+            <w:tcW w:type="dxa" w:w="918"/>
             <w:vAlign w:val="center"/>
             <w:shd w:fill="FFFFFF"/>
             <w:tcMar>
@@ -15269,7 +15223,7 @@
         </w:tc>
         <w:tc>
           <w:tcPr>
-            <w:tcW w:type="dxa" w:w="1134"/>
+            <w:tcW w:type="dxa" w:w="1990"/>
             <w:vAlign w:val="center"/>
             <w:shd w:fill="FFFFFF"/>
             <w:tcMar>
@@ -15303,7 +15257,7 @@
         </w:trPr>
         <w:tc>
           <w:tcPr>
-            <w:tcW w:type="dxa" w:w="1134"/>
+            <w:tcW w:type="dxa" w:w="1174"/>
             <w:vAlign w:val="center"/>
             <w:shd w:fill="F3F4F6"/>
             <w:tcMar>
@@ -15332,7 +15286,7 @@
         </w:tc>
         <w:tc>
           <w:tcPr>
-            <w:tcW w:type="dxa" w:w="1134"/>
+            <w:tcW w:type="dxa" w:w="1225"/>
             <w:vAlign w:val="center"/>
             <w:shd w:fill="F3F4F6"/>
             <w:tcMar>
@@ -15361,7 +15315,7 @@
         </w:tc>
         <w:tc>
           <w:tcPr>
-            <w:tcW w:type="dxa" w:w="1134"/>
+            <w:tcW w:type="dxa" w:w="867"/>
             <w:vAlign w:val="center"/>
             <w:shd w:fill="F3F4F6"/>
             <w:tcMar>
@@ -15390,7 +15344,7 @@
         </w:tc>
         <w:tc>
           <w:tcPr>
-            <w:tcW w:type="dxa" w:w="1134"/>
+            <w:tcW w:type="dxa" w:w="1071"/>
             <w:vAlign w:val="center"/>
             <w:shd w:fill="F3F4F6"/>
             <w:tcMar>
@@ -15419,7 +15373,7 @@
         </w:tc>
         <w:tc>
           <w:tcPr>
-            <w:tcW w:type="dxa" w:w="1134"/>
+            <w:tcW w:type="dxa" w:w="969"/>
             <w:vAlign w:val="center"/>
             <w:shd w:fill="F3F4F6"/>
             <w:tcMar>
@@ -15448,7 +15402,7 @@
         </w:tc>
         <w:tc>
           <w:tcPr>
-            <w:tcW w:type="dxa" w:w="1134"/>
+            <w:tcW w:type="dxa" w:w="1071"/>
             <w:vAlign w:val="center"/>
             <w:shd w:fill="F3F4F6"/>
             <w:tcMar>
@@ -15477,7 +15431,7 @@
         </w:tc>
         <w:tc>
           <w:tcPr>
-            <w:tcW w:type="dxa" w:w="1134"/>
+            <w:tcW w:type="dxa" w:w="918"/>
             <w:vAlign w:val="center"/>
             <w:shd w:fill="F3F4F6"/>
             <w:tcMar>
@@ -15506,7 +15460,7 @@
         </w:tc>
         <w:tc>
           <w:tcPr>
-            <w:tcW w:type="dxa" w:w="1134"/>
+            <w:tcW w:type="dxa" w:w="918"/>
             <w:vAlign w:val="center"/>
             <w:shd w:fill="F3F4F6"/>
             <w:tcMar>
@@ -15535,7 +15489,7 @@
         </w:tc>
         <w:tc>
           <w:tcPr>
-            <w:tcW w:type="dxa" w:w="1134"/>
+            <w:tcW w:type="dxa" w:w="1990"/>
             <w:vAlign w:val="center"/>
             <w:shd w:fill="F3F4F6"/>
             <w:tcMar>

</xml_diff>